<commit_message>
the chart and the table beneath it plotted different answers
Fixing the sensitivity table's basis and not the figure above it left the
picture on the book minority while the table under it read the adopted one
— the chart landing five to twenty pounds a share low against its own
table. The workbook's sensitivity sheet had the same shape with a further
twist: both its per-share columns took the book figure and only the second
said so, so a reader taking the unlabelled column for the study's answer
got a different one. Both now read the adopted basis and both say which.

The document said the minority is deducted "two different ways" in two
places and "three bases" in a third, while the summary table publishes
three columns. The count is now taken from the bases the study actually
carries, so it cannot disagree with the table it sits under.

Co-Authored-By: Claude Opus 5 <noreply@anthropic.com>
Claude-Session: https://claude.ai/code/session_017RcjXG4ETjADcoFJf123yY
</commit_message>
<xml_diff>
--- a/engine/tmgh_study/TMGH_Valuation_Study_02-09-2026.docx
+++ b/engine/tmgh_study/TMGH_Valuation_Study_02-09-2026.docx
@@ -116,7 +116,7 @@
           <w:color w:val="1A1D21"/>
           <w:sz w:val="20"/>
         </w:rPr>
-        <w:t>Nearly half the group does not belong to TMG's shareholders. Non-controlling interests are 45.2% of consolidated equity after the 2024 hotel acquisition and the project-company structures. Every value here is shown with that minority deducted two different ways.</w:t>
+        <w:t>Nearly half the group does not belong to TMG's shareholders. Non-controlling interests are 45.2% of consolidated equity after the 2024 hotel acquisition and the project-company structures. Every value here is shown with that minority deducted three different ways.</w:t>
       </w:r>
     </w:p>
     <w:p>
@@ -260,10 +260,10 @@
         <w:tblLayout w:type="fixed"/>
       </w:tblPr>
       <w:tblGrid>
-        <w:gridCol w:w="2665"/>
+        <w:gridCol w:w="2625"/>
         <w:gridCol w:w="1151"/>
         <w:gridCol w:w="1378"/>
-        <w:gridCol w:w="1162"/>
+        <w:gridCol w:w="1202"/>
         <w:gridCol w:w="1151"/>
         <w:gridCol w:w="868"/>
         <w:gridCol w:w="868"/>
@@ -274,7 +274,7 @@
         </w:trPr>
         <w:tc>
           <w:tcPr>
-            <w:tcW w:type="dxa" w:w="2665"/>
+            <w:tcW w:type="dxa" w:w="2625"/>
           </w:tcPr>
           <w:p>
             <w:r/>
@@ -322,7 +322,7 @@
         </w:tc>
         <w:tc>
           <w:tcPr>
-            <w:tcW w:type="dxa" w:w="1162"/>
+            <w:tcW w:type="dxa" w:w="1202"/>
           </w:tcPr>
           <w:p>
             <w:r/>
@@ -391,7 +391,7 @@
         </w:trPr>
         <w:tc>
           <w:tcPr>
-            <w:tcW w:type="dxa" w:w="2665"/>
+            <w:tcW w:type="dxa" w:w="2625"/>
           </w:tcPr>
           <w:p>
             <w:r/>
@@ -442,7 +442,7 @@
         </w:tc>
         <w:tc>
           <w:tcPr>
-            <w:tcW w:type="dxa" w:w="1162"/>
+            <w:tcW w:type="dxa" w:w="1202"/>
           </w:tcPr>
           <w:p>
             <w:pPr>
@@ -519,7 +519,7 @@
         </w:trPr>
         <w:tc>
           <w:tcPr>
-            <w:tcW w:type="dxa" w:w="2665"/>
+            <w:tcW w:type="dxa" w:w="2625"/>
           </w:tcPr>
           <w:p>
             <w:r/>
@@ -570,7 +570,7 @@
         </w:tc>
         <w:tc>
           <w:tcPr>
-            <w:tcW w:type="dxa" w:w="1162"/>
+            <w:tcW w:type="dxa" w:w="1202"/>
           </w:tcPr>
           <w:p>
             <w:pPr>
@@ -647,7 +647,7 @@
         </w:trPr>
         <w:tc>
           <w:tcPr>
-            <w:tcW w:type="dxa" w:w="2665"/>
+            <w:tcW w:type="dxa" w:w="2625"/>
           </w:tcPr>
           <w:p>
             <w:r/>
@@ -698,7 +698,7 @@
         </w:tc>
         <w:tc>
           <w:tcPr>
-            <w:tcW w:type="dxa" w:w="1162"/>
+            <w:tcW w:type="dxa" w:w="1202"/>
           </w:tcPr>
           <w:p>
             <w:pPr>
@@ -775,7 +775,7 @@
         </w:trPr>
         <w:tc>
           <w:tcPr>
-            <w:tcW w:type="dxa" w:w="2665"/>
+            <w:tcW w:type="dxa" w:w="2625"/>
           </w:tcPr>
           <w:p>
             <w:r/>
@@ -826,7 +826,7 @@
         </w:tc>
         <w:tc>
           <w:tcPr>
-            <w:tcW w:type="dxa" w:w="1162"/>
+            <w:tcW w:type="dxa" w:w="1202"/>
           </w:tcPr>
           <w:p>
             <w:pPr>
@@ -11324,7 +11324,7 @@
           <w:color w:val="1A1D21"/>
           <w:sz w:val="20"/>
         </w:rPr>
-        <w:t>Nearly half the group belongs to somebody else. Non-controlling interests are 45.2% of consolidated equity, and the company does not disclose its economic share project by project, so the deduction is made two ways and both are published.</w:t>
+        <w:t>Nearly half the group belongs to somebody else. Non-controlling interests are 45.2% of consolidated equity, and the company does not disclose its economic share project by project, so the deduction is made three ways and all are published.</w:t>
       </w:r>
     </w:p>
     <w:p>

</xml_diff>